<commit_message>
Class-code naming scheme: <Elev><Moist><DOY-rank> for meadow classes
Per user direction: elevation M/S/A (montane/subalpine/alpine), moisture
D/M/W (dry/mesic/Wetland - the W flags wetland classes), and a 2-digit
rank of mean snow-free DOY across the scheme, so MD01 melts first and
SM45 last. Codes are generated deterministically at the end of 11 from
class_categories.csv (still keyed by internal labels) + environment.rds;
data/derived/class_codes.csv is the authoritative internal<->code map
and asg$internal_label keeps provenance. 20 now reads moisture/elevation
from class_codes.csv; label_community_names.csv migrated to code keys
(all 45 curated narratives preserved).

Full cascade re-run under codes (joint 62 classes, CV 62.9%); review
artifact, DOCX, confusion matrix and joint_training.gpkg all regenerated
with codes + internal-label provenance.

Co-Authored-By: Claude Fable 5 <noreply@anthropic.com>
</commit_message>
<xml_diff>
--- a/docs/CHESS_vegetation_classes_review.docx
+++ b/docs/CHESS_vegetation_classes_review.docx
@@ -222,6 +222,11 @@
     </w:p>
     <w:p>
       <w:r>
+        <w:t>Class codes: meadow classes are named &lt;Elevation&gt;&lt;Moisture&gt;&lt;NN&gt; - elevation M/S/A (montane/subalpine/alpine), moisture D/M/W (dry/mesic/Wetland), and a two-digit rank of mean snow-free DOY across the scheme (MD01 melts first, SM45 last). Internal pipeline labels are shown on each sheet; class_codes.csv is the authoritative mapping.</w:t>
+      </w:r>
+    </w:p>
+    <w:p>
+      <w:r>
         <w:t>Splitting and merging policy: the class set is deliberately over-split — sub-classes marked “floristic split” were separated on species composition alone (mean Hellinger silhouette ≥ 0.30) even though today's 22 spectral features cannot reliably map them. The planned ML-ensemble + covariate pipeline gets clean floristic training units now; merging later is cheap. A phenology-coherence pass split ecologically broad dry/mesic classes at snow-free-DOY discontinuities into early/late facies (.e/.l) and reassigned small DOY-outlier groups to their true classes; wet classes are exempt. The complementary merge pass rejoined classes from different spectral clusters that are one community (low Hellinger centroid distance AND the same top-1 NatureServe candidate): the M-classes. Expect low classifier recall on flagged sub-classes — by design, not a defect.</w:t>
       </w:r>
     </w:p>
@@ -354,7 +359,7 @@
               <w:rPr>
                 <w:sz w:val="17"/>
               </w:rPr>
-              <w:t>S24.b</w:t>
+              <w:t>MD01</w:t>
             </w:r>
           </w:p>
         </w:tc>
@@ -406,7 +411,7 @@
               <w:rPr>
                 <w:sz w:val="17"/>
               </w:rPr>
-              <w:t>0.33</w:t>
+              <w:t>0.44</w:t>
             </w:r>
           </w:p>
         </w:tc>
@@ -434,7 +439,7 @@
               <w:rPr>
                 <w:sz w:val="17"/>
               </w:rPr>
-              <w:t>S24.a</w:t>
+              <w:t>MD02</w:t>
             </w:r>
           </w:p>
         </w:tc>
@@ -486,7 +491,7 @@
               <w:rPr>
                 <w:sz w:val="17"/>
               </w:rPr>
-              <w:t>0.67</w:t>
+              <w:t>0.78</w:t>
             </w:r>
           </w:p>
         </w:tc>
@@ -514,7 +519,7 @@
               <w:rPr>
                 <w:sz w:val="17"/>
               </w:rPr>
-              <w:t>S25</w:t>
+              <w:t>MD03</w:t>
             </w:r>
           </w:p>
         </w:tc>
@@ -566,7 +571,7 @@
               <w:rPr>
                 <w:sz w:val="17"/>
               </w:rPr>
-              <w:t>0.90</w:t>
+              <w:t>0.95</w:t>
             </w:r>
           </w:p>
         </w:tc>
@@ -594,7 +599,7 @@
               <w:rPr>
                 <w:sz w:val="17"/>
               </w:rPr>
-              <w:t>S04.b.e</w:t>
+              <w:t>MD04</w:t>
             </w:r>
           </w:p>
         </w:tc>
@@ -674,7 +679,7 @@
               <w:rPr>
                 <w:sz w:val="17"/>
               </w:rPr>
-              <w:t>S17</w:t>
+              <w:t>MD06</w:t>
             </w:r>
           </w:p>
         </w:tc>
@@ -726,7 +731,7 @@
               <w:rPr>
                 <w:sz w:val="17"/>
               </w:rPr>
-              <w:t>0.71</w:t>
+              <w:t>0.86</w:t>
             </w:r>
           </w:p>
         </w:tc>
@@ -754,7 +759,7 @@
               <w:rPr>
                 <w:sz w:val="17"/>
               </w:rPr>
-              <w:t>S18</w:t>
+              <w:t>MD05</w:t>
             </w:r>
           </w:p>
         </w:tc>
@@ -806,7 +811,7 @@
               <w:rPr>
                 <w:sz w:val="17"/>
               </w:rPr>
-              <w:t>0.93</w:t>
+              <w:t>0.87</w:t>
             </w:r>
           </w:p>
         </w:tc>
@@ -834,7 +839,7 @@
               <w:rPr>
                 <w:sz w:val="17"/>
               </w:rPr>
-              <w:t>S26</w:t>
+              <w:t>MM07</w:t>
             </w:r>
           </w:p>
         </w:tc>
@@ -914,7 +919,7 @@
               <w:rPr>
                 <w:sz w:val="17"/>
               </w:rPr>
-              <w:t>S01.a.e</w:t>
+              <w:t>MD08</w:t>
             </w:r>
           </w:p>
         </w:tc>
@@ -994,7 +999,7 @@
               <w:rPr>
                 <w:sz w:val="17"/>
               </w:rPr>
-              <w:t>S19.e</w:t>
+              <w:t>MD09</w:t>
             </w:r>
           </w:p>
         </w:tc>
@@ -1046,7 +1051,7 @@
               <w:rPr>
                 <w:sz w:val="17"/>
               </w:rPr>
-              <w:t>0.82</w:t>
+              <w:t>0.73</w:t>
             </w:r>
           </w:p>
         </w:tc>
@@ -1074,7 +1079,7 @@
               <w:rPr>
                 <w:sz w:val="17"/>
               </w:rPr>
-              <w:t>S02.a.e</w:t>
+              <w:t>MM10</w:t>
             </w:r>
           </w:p>
         </w:tc>
@@ -1126,7 +1131,7 @@
               <w:rPr>
                 <w:sz w:val="17"/>
               </w:rPr>
-              <w:t>0.74</w:t>
+              <w:t>0.84</w:t>
             </w:r>
           </w:p>
         </w:tc>
@@ -1154,7 +1159,7 @@
               <w:rPr>
                 <w:sz w:val="17"/>
               </w:rPr>
-              <w:t>S10.b</w:t>
+              <w:t>MM12</w:t>
             </w:r>
           </w:p>
         </w:tc>
@@ -1234,7 +1239,7 @@
               <w:rPr>
                 <w:sz w:val="17"/>
               </w:rPr>
-              <w:t>M04</w:t>
+              <w:t>MD11</w:t>
             </w:r>
           </w:p>
         </w:tc>
@@ -1286,7 +1291,7 @@
               <w:rPr>
                 <w:sz w:val="17"/>
               </w:rPr>
-              <w:t>0.31</w:t>
+              <w:t>0.19</w:t>
             </w:r>
           </w:p>
         </w:tc>
@@ -1314,7 +1319,7 @@
               <w:rPr>
                 <w:sz w:val="17"/>
               </w:rPr>
-              <w:t>M03</w:t>
+              <w:t>MD13</w:t>
             </w:r>
           </w:p>
         </w:tc>
@@ -1366,7 +1371,7 @@
               <w:rPr>
                 <w:sz w:val="17"/>
               </w:rPr>
-              <w:t>0.50</w:t>
+              <w:t>0.53</w:t>
             </w:r>
           </w:p>
         </w:tc>
@@ -1394,7 +1399,7 @@
               <w:rPr>
                 <w:sz w:val="17"/>
               </w:rPr>
-              <w:t>S01.b</w:t>
+              <w:t>MD14</w:t>
             </w:r>
           </w:p>
         </w:tc>
@@ -1446,7 +1451,7 @@
               <w:rPr>
                 <w:sz w:val="17"/>
               </w:rPr>
-              <w:t>0.00</w:t>
+              <w:t>0.08</w:t>
             </w:r>
           </w:p>
         </w:tc>
@@ -1474,7 +1479,7 @@
               <w:rPr>
                 <w:sz w:val="17"/>
               </w:rPr>
-              <w:t>S02.b</w:t>
+              <w:t>MM16</w:t>
             </w:r>
           </w:p>
         </w:tc>
@@ -1554,7 +1559,7 @@
               <w:rPr>
                 <w:sz w:val="17"/>
               </w:rPr>
-              <w:t>S04.a</w:t>
+              <w:t>MD15</w:t>
             </w:r>
           </w:p>
         </w:tc>
@@ -1634,7 +1639,7 @@
               <w:rPr>
                 <w:sz w:val="17"/>
               </w:rPr>
-              <w:t>S22</w:t>
+              <w:t>MD18</w:t>
             </w:r>
           </w:p>
         </w:tc>
@@ -1686,7 +1691,7 @@
               <w:rPr>
                 <w:sz w:val="17"/>
               </w:rPr>
-              <w:t>0.88</w:t>
+              <w:t>0.94</w:t>
             </w:r>
           </w:p>
         </w:tc>
@@ -1714,7 +1719,7 @@
               <w:rPr>
                 <w:sz w:val="17"/>
               </w:rPr>
-              <w:t>S05.a</w:t>
+              <w:t>MD17</w:t>
             </w:r>
           </w:p>
         </w:tc>
@@ -1766,7 +1771,7 @@
               <w:rPr>
                 <w:sz w:val="17"/>
               </w:rPr>
-              <w:t>0.75</w:t>
+              <w:t>0.83</w:t>
             </w:r>
           </w:p>
         </w:tc>
@@ -1794,7 +1799,7 @@
               <w:rPr>
                 <w:sz w:val="17"/>
               </w:rPr>
-              <w:t>S11</w:t>
+              <w:t>MM19</w:t>
             </w:r>
           </w:p>
         </w:tc>
@@ -1874,7 +1879,7 @@
               <w:rPr>
                 <w:sz w:val="17"/>
               </w:rPr>
-              <w:t>S10.a</w:t>
+              <w:t>MM20</w:t>
             </w:r>
           </w:p>
         </w:tc>
@@ -1926,7 +1931,7 @@
               <w:rPr>
                 <w:sz w:val="17"/>
               </w:rPr>
-              <w:t>0.54</w:t>
+              <w:t>0.73</w:t>
             </w:r>
           </w:p>
         </w:tc>
@@ -1954,7 +1959,7 @@
               <w:rPr>
                 <w:sz w:val="17"/>
               </w:rPr>
-              <w:t>S04.b.l</w:t>
+              <w:t>MD21</w:t>
             </w:r>
           </w:p>
         </w:tc>
@@ -2006,7 +2011,7 @@
               <w:rPr>
                 <w:sz w:val="17"/>
               </w:rPr>
-              <w:t>0.48</w:t>
+              <w:t>0.52</w:t>
             </w:r>
           </w:p>
         </w:tc>
@@ -2034,7 +2039,7 @@
               <w:rPr>
                 <w:sz w:val="17"/>
               </w:rPr>
-              <w:t>S19.l</w:t>
+              <w:t>MD22</w:t>
             </w:r>
           </w:p>
         </w:tc>
@@ -2114,7 +2119,7 @@
               <w:rPr>
                 <w:sz w:val="17"/>
               </w:rPr>
-              <w:t>S01.a.l</w:t>
+              <w:t>MD23</w:t>
             </w:r>
           </w:p>
         </w:tc>
@@ -2166,7 +2171,7 @@
               <w:rPr>
                 <w:sz w:val="17"/>
               </w:rPr>
-              <w:t>0.74</w:t>
+              <w:t>0.61</w:t>
             </w:r>
           </w:p>
         </w:tc>
@@ -2194,7 +2199,7 @@
               <w:rPr>
                 <w:sz w:val="17"/>
               </w:rPr>
-              <w:t>S20</w:t>
+              <w:t>MD24</w:t>
             </w:r>
           </w:p>
         </w:tc>
@@ -2274,7 +2279,7 @@
               <w:rPr>
                 <w:sz w:val="17"/>
               </w:rPr>
-              <w:t>S10.c</w:t>
+              <w:t>MM25</w:t>
             </w:r>
           </w:p>
         </w:tc>
@@ -2326,7 +2331,7 @@
               <w:rPr>
                 <w:sz w:val="17"/>
               </w:rPr>
-              <w:t>0.00</w:t>
+              <w:t>0.10</w:t>
             </w:r>
           </w:p>
         </w:tc>
@@ -2354,7 +2359,7 @@
               <w:rPr>
                 <w:sz w:val="17"/>
               </w:rPr>
-              <w:t>S02.a.l</w:t>
+              <w:t>MM26</w:t>
             </w:r>
           </w:p>
         </w:tc>
@@ -2406,7 +2411,7 @@
               <w:rPr>
                 <w:sz w:val="17"/>
               </w:rPr>
-              <w:t>0.79</w:t>
+              <w:t>0.75</w:t>
             </w:r>
           </w:p>
         </w:tc>
@@ -2546,7 +2551,7 @@
               <w:rPr>
                 <w:sz w:val="17"/>
               </w:rPr>
-              <w:t>Osmorhiza occidentalis</w:t>
+              <w:t>SM27</w:t>
             </w:r>
           </w:p>
         </w:tc>
@@ -2626,7 +2631,7 @@
               <w:rPr>
                 <w:sz w:val="17"/>
               </w:rPr>
-              <w:t>S06.b</w:t>
+              <w:t>SM28</w:t>
             </w:r>
           </w:p>
         </w:tc>
@@ -2678,7 +2683,7 @@
               <w:rPr>
                 <w:sz w:val="17"/>
               </w:rPr>
-              <w:t>0.77</w:t>
+              <w:t>0.78</w:t>
             </w:r>
           </w:p>
         </w:tc>
@@ -2706,7 +2711,7 @@
               <w:rPr>
                 <w:sz w:val="17"/>
               </w:rPr>
-              <w:t>Veratrum tenuipetalum</w:t>
+              <w:t>SW29</w:t>
             </w:r>
           </w:p>
         </w:tc>
@@ -2758,7 +2763,7 @@
               <w:rPr>
                 <w:sz w:val="17"/>
               </w:rPr>
-              <w:t>0.32</w:t>
+              <w:t>0.26</w:t>
             </w:r>
           </w:p>
         </w:tc>
@@ -2786,7 +2791,7 @@
               <w:rPr>
                 <w:sz w:val="17"/>
               </w:rPr>
-              <w:t>S23</w:t>
+              <w:t>SM30</w:t>
             </w:r>
           </w:p>
         </w:tc>
@@ -2866,7 +2871,7 @@
               <w:rPr>
                 <w:sz w:val="17"/>
               </w:rPr>
-              <w:t>Ligusticum porteri</w:t>
+              <w:t>SW31</w:t>
             </w:r>
           </w:p>
         </w:tc>
@@ -2946,7 +2951,7 @@
               <w:rPr>
                 <w:sz w:val="17"/>
               </w:rPr>
-              <w:t>S15</w:t>
+              <w:t>SW32</w:t>
             </w:r>
           </w:p>
         </w:tc>
@@ -2998,7 +3003,7 @@
               <w:rPr>
                 <w:sz w:val="17"/>
               </w:rPr>
-              <w:t>0.62</w:t>
+              <w:t>0.75</w:t>
             </w:r>
           </w:p>
         </w:tc>
@@ -3026,7 +3031,7 @@
               <w:rPr>
                 <w:sz w:val="17"/>
               </w:rPr>
-              <w:t>S08.a.e</w:t>
+              <w:t>SM33</w:t>
             </w:r>
           </w:p>
         </w:tc>
@@ -3078,7 +3083,7 @@
               <w:rPr>
                 <w:sz w:val="17"/>
               </w:rPr>
-              <w:t>0.64</w:t>
+              <w:t>0.43</w:t>
             </w:r>
           </w:p>
         </w:tc>
@@ -3106,7 +3111,7 @@
               <w:rPr>
                 <w:sz w:val="17"/>
               </w:rPr>
-              <w:t>S09.a</w:t>
+              <w:t>SM34</w:t>
             </w:r>
           </w:p>
         </w:tc>
@@ -3158,7 +3163,7 @@
               <w:rPr>
                 <w:sz w:val="17"/>
               </w:rPr>
-              <w:t>0.79</w:t>
+              <w:t>0.74</w:t>
             </w:r>
           </w:p>
         </w:tc>
@@ -3186,7 +3191,7 @@
               <w:rPr>
                 <w:sz w:val="17"/>
               </w:rPr>
-              <w:t>M02</w:t>
+              <w:t>SM35</w:t>
             </w:r>
           </w:p>
         </w:tc>
@@ -3238,7 +3243,7 @@
               <w:rPr>
                 <w:sz w:val="17"/>
               </w:rPr>
-              <w:t>0.43</w:t>
+              <w:t>0.39</w:t>
             </w:r>
           </w:p>
         </w:tc>
@@ -3266,7 +3271,7 @@
               <w:rPr>
                 <w:sz w:val="17"/>
               </w:rPr>
-              <w:t>S03</w:t>
+              <w:t>SW36</w:t>
             </w:r>
           </w:p>
         </w:tc>
@@ -3318,7 +3323,7 @@
               <w:rPr>
                 <w:sz w:val="17"/>
               </w:rPr>
-              <w:t>0.68</w:t>
+              <w:t>0.73</w:t>
             </w:r>
           </w:p>
         </w:tc>
@@ -3346,7 +3351,7 @@
               <w:rPr>
                 <w:sz w:val="17"/>
               </w:rPr>
-              <w:t>Corydalis caseana</w:t>
+              <w:t>SW37</w:t>
             </w:r>
           </w:p>
         </w:tc>
@@ -3426,7 +3431,7 @@
               <w:rPr>
                 <w:sz w:val="17"/>
               </w:rPr>
-              <w:t>S13.b</w:t>
+              <w:t>SM38</w:t>
             </w:r>
           </w:p>
         </w:tc>
@@ -3506,7 +3511,7 @@
               <w:rPr>
                 <w:sz w:val="17"/>
               </w:rPr>
-              <w:t>Caltha leptosepala</w:t>
+              <w:t>SW39</w:t>
             </w:r>
           </w:p>
         </w:tc>
@@ -3586,7 +3591,7 @@
               <w:rPr>
                 <w:sz w:val="17"/>
               </w:rPr>
-              <w:t>M01</w:t>
+              <w:t>SM40</w:t>
             </w:r>
           </w:p>
         </w:tc>
@@ -3666,7 +3671,7 @@
               <w:rPr>
                 <w:sz w:val="17"/>
               </w:rPr>
-              <w:t>S21</w:t>
+              <w:t>SM41</w:t>
             </w:r>
           </w:p>
         </w:tc>
@@ -3718,7 +3723,7 @@
               <w:rPr>
                 <w:sz w:val="17"/>
               </w:rPr>
-              <w:t>0.64</w:t>
+              <w:t>0.86</w:t>
             </w:r>
           </w:p>
         </w:tc>
@@ -3746,7 +3751,7 @@
               <w:rPr>
                 <w:sz w:val="17"/>
               </w:rPr>
-              <w:t>S12</w:t>
+              <w:t>SD42</w:t>
             </w:r>
           </w:p>
         </w:tc>
@@ -3826,7 +3831,7 @@
               <w:rPr>
                 <w:sz w:val="17"/>
               </w:rPr>
-              <w:t>S08.a.l</w:t>
+              <w:t>SM45</w:t>
             </w:r>
           </w:p>
         </w:tc>
@@ -3878,7 +3883,7 @@
               <w:rPr>
                 <w:sz w:val="17"/>
               </w:rPr>
-              <w:t>0.62</w:t>
+              <w:t>0.69</w:t>
             </w:r>
           </w:p>
         </w:tc>
@@ -4018,7 +4023,7 @@
               <w:rPr>
                 <w:sz w:val="17"/>
               </w:rPr>
-              <w:t>S14</w:t>
+              <w:t>AW43</w:t>
             </w:r>
           </w:p>
         </w:tc>
@@ -4098,7 +4103,7 @@
               <w:rPr>
                 <w:sz w:val="17"/>
               </w:rPr>
-              <w:t>S07</w:t>
+              <w:t>AW44</w:t>
             </w:r>
           </w:p>
         </w:tc>
@@ -4150,7 +4155,7 @@
               <w:rPr>
                 <w:sz w:val="17"/>
               </w:rPr>
-              <w:t>0.69</w:t>
+              <w:t>0.65</w:t>
             </w:r>
           </w:p>
         </w:tc>
@@ -4190,7 +4195,18 @@
         <w:pStyle w:val="Heading3"/>
       </w:pPr>
       <w:r>
-        <w:t>S24.b — Dense sagebrush-aspen edge</w:t>
+        <w:t>MD01 — Dense sagebrush-aspen edge</w:t>
+      </w:r>
+    </w:p>
+    <w:p>
+      <w:r>
+        <w:rPr>
+          <w:b w:val="0"/>
+          <w:i w:val="0"/>
+          <w:color w:val="6B7263"/>
+          <w:sz w:val="18"/>
+        </w:rPr>
+        <w:t>internal label: S24.b</w:t>
       </w:r>
     </w:p>
     <w:p>
@@ -4212,7 +4228,7 @@
           <w:color w:val="6B7263"/>
           <w:sz w:val="18"/>
         </w:rPr>
-        <w:t>n = 9  (’18/’23/’25/’26: 0/0/0/9)   snow-free DOY 85   joint recall 0.33   bare 25%   NPV 22.2%</w:t>
+        <w:t>n = 9  (’18/’23/’25/’26: 0/0/0/9)   snow-free DOY 85   joint recall 0.44   bare 25%   NPV 22.2%</w:t>
       </w:r>
     </w:p>
     <w:p>
@@ -4239,7 +4255,7 @@
           <w:color w:val="6B7263"/>
           <w:sz w:val="18"/>
         </w:rPr>
-        <w:t>Confused with: S24.a (7); S25 (1)</w:t>
+        <w:t>Confused with: MD02 (6)</w:t>
       </w:r>
     </w:p>
     <w:tbl>
@@ -4588,7 +4604,18 @@
         <w:pStyle w:val="Heading3"/>
       </w:pPr>
       <w:r>
-        <w:t>S24.a — Bitterbrush-cactus steppe</w:t>
+        <w:t>MD02 — Bitterbrush-cactus steppe</w:t>
+      </w:r>
+    </w:p>
+    <w:p>
+      <w:r>
+        <w:rPr>
+          <w:b w:val="0"/>
+          <w:i w:val="0"/>
+          <w:color w:val="6B7263"/>
+          <w:sz w:val="18"/>
+        </w:rPr>
+        <w:t>internal label: S24.a</w:t>
       </w:r>
     </w:p>
     <w:p>
@@ -4610,7 +4637,7 @@
           <w:color w:val="6B7263"/>
           <w:sz w:val="18"/>
         </w:rPr>
-        <w:t>n = 18  (’18/’23/’25/’26: 0/0/0/18)   snow-free DOY 88   joint recall 0.67   bare 29.2%   NPV 24.2%</w:t>
+        <w:t>n = 18  (’18/’23/’25/’26: 0/0/0/18)   snow-free DOY 88   joint recall 0.78   bare 29.2%   NPV 24.2%</w:t>
       </w:r>
     </w:p>
     <w:p>
@@ -4637,7 +4664,7 @@
           <w:color w:val="6B7263"/>
           <w:sz w:val="18"/>
         </w:rPr>
-        <w:t>Confused with: S24.b (5); S04.b.e (1)</w:t>
+        <w:t>Confused with: MD01 (4); MD03 (2)</w:t>
       </w:r>
     </w:p>
     <w:tbl>
@@ -4986,7 +5013,18 @@
         <w:pStyle w:val="Heading3"/>
       </w:pPr>
       <w:r>
-        <w:t>S25 — Low mixed shrub-steppe</w:t>
+        <w:t>MD03 — Low mixed shrub-steppe</w:t>
+      </w:r>
+    </w:p>
+    <w:p>
+      <w:r>
+        <w:rPr>
+          <w:b w:val="0"/>
+          <w:i w:val="0"/>
+          <w:color w:val="6B7263"/>
+          <w:sz w:val="18"/>
+        </w:rPr>
+        <w:t>internal label: S25</w:t>
       </w:r>
     </w:p>
     <w:p>
@@ -5008,7 +5046,7 @@
           <w:color w:val="6B7263"/>
           <w:sz w:val="18"/>
         </w:rPr>
-        <w:t>n = 21  (’18/’23/’25/’26: 0/1/1/19)   snow-free DOY 97   joint recall 0.90   bare 33.1%   NPV 18.1%</w:t>
+        <w:t>n = 21  (’18/’23/’25/’26: 0/1/1/19)   snow-free DOY 97   joint recall 0.95   bare 33.1%   NPV 18.1%</w:t>
       </w:r>
     </w:p>
     <w:p>
@@ -5373,7 +5411,18 @@
         <w:pStyle w:val="Heading3"/>
       </w:pPr>
       <w:r>
-        <w:t>S04.b.e — Kinnikinnick-bitterbrush steppe</w:t>
+        <w:t>MD04 — Kinnikinnick-bitterbrush steppe</w:t>
+      </w:r>
+    </w:p>
+    <w:p>
+      <w:r>
+        <w:rPr>
+          <w:b w:val="0"/>
+          <w:i w:val="0"/>
+          <w:color w:val="6B7263"/>
+          <w:sz w:val="18"/>
+        </w:rPr>
+        <w:t>internal label: S04.b.e</w:t>
       </w:r>
     </w:p>
     <w:p>
@@ -5422,7 +5471,7 @@
           <w:color w:val="6B7263"/>
           <w:sz w:val="18"/>
         </w:rPr>
-        <w:t>Confused with: S18 (4); S19.e (1)</w:t>
+        <w:t>Confused with: MD05 (3); MD09 (1)</w:t>
       </w:r>
     </w:p>
     <w:p>
@@ -5782,7 +5831,18 @@
         <w:pStyle w:val="Heading3"/>
       </w:pPr>
       <w:r>
-        <w:t>S17 — Shale barren shrub-steppe</w:t>
+        <w:t>MD06 — Shale barren shrub-steppe</w:t>
+      </w:r>
+    </w:p>
+    <w:p>
+      <w:r>
+        <w:rPr>
+          <w:b w:val="0"/>
+          <w:i w:val="0"/>
+          <w:color w:val="6B7263"/>
+          <w:sz w:val="18"/>
+        </w:rPr>
+        <w:t>internal label: S17</w:t>
       </w:r>
     </w:p>
     <w:p>
@@ -5804,7 +5864,7 @@
           <w:color w:val="6B7263"/>
           <w:sz w:val="18"/>
         </w:rPr>
-        <w:t>n = 7  (’18/’23/’25/’26: 0/0/6/1)   snow-free DOY 102   joint recall 0.71   bare 55.7%   NPV 6.4%</w:t>
+        <w:t>n = 7  (’18/’23/’25/’26: 0/0/6/1)   snow-free DOY 102   joint recall 0.86   bare 55.7%   NPV 6.4%</w:t>
       </w:r>
     </w:p>
     <w:p>
@@ -5823,17 +5883,6 @@
         <w:t>Indicators: Chrysothamnus depressus (9.3%, IV 24.4); Balsamorhiza sagittata (7.9%, IV 12.6); Phlox multiflora (4.3%, IV 5.2); Tetradymia canescens (2.9%, IV 3.8); Amelanchier alnifolia (1.4%, IV 0.5)</w:t>
       </w:r>
     </w:p>
-    <w:p>
-      <w:r>
-        <w:rPr>
-          <w:b w:val="0"/>
-          <w:i w:val="0"/>
-          <w:color w:val="6B7263"/>
-          <w:sz w:val="18"/>
-        </w:rPr>
-        <w:t>Confused with: S02.a.e (1); S04.b.e (1)</w:t>
-      </w:r>
-    </w:p>
     <w:tbl>
       <w:tblPr>
         <w:tblStyle w:val="TableGrid"/>
@@ -6180,7 +6229,18 @@
         <w:pStyle w:val="Heading3"/>
       </w:pPr>
       <w:r>
-        <w:t>S18 — Low sagebrush-rabbitbrush steppe</w:t>
+        <w:t>MD05 — Low sagebrush-rabbitbrush steppe</w:t>
+      </w:r>
+    </w:p>
+    <w:p>
+      <w:r>
+        <w:rPr>
+          <w:b w:val="0"/>
+          <w:i w:val="0"/>
+          <w:color w:val="6B7263"/>
+          <w:sz w:val="18"/>
+        </w:rPr>
+        <w:t>internal label: S18</w:t>
       </w:r>
     </w:p>
     <w:p>
@@ -6202,7 +6262,7 @@
           <w:color w:val="6B7263"/>
           <w:sz w:val="18"/>
         </w:rPr>
-        <w:t>n = 30  (’18/’23/’25/’26: 0/2/21/7)   snow-free DOY 102   joint recall 0.93   bare 26.8%   NPV 23.7%</w:t>
+        <w:t>n = 30  (’18/’23/’25/’26: 0/2/21/7)   snow-free DOY 102   joint recall 0.87   bare 26.8%   NPV 23.7%</w:t>
       </w:r>
     </w:p>
     <w:p>
@@ -6567,7 +6627,18 @@
         <w:pStyle w:val="Heading3"/>
       </w:pPr>
       <w:r>
-        <w:t>S26 — Chokecherry tall shrub</w:t>
+        <w:t>MM07 — Chokecherry tall shrub</w:t>
+      </w:r>
+    </w:p>
+    <w:p>
+      <w:r>
+        <w:rPr>
+          <w:b w:val="0"/>
+          <w:i w:val="0"/>
+          <w:color w:val="6B7263"/>
+          <w:sz w:val="18"/>
+        </w:rPr>
+        <w:t>internal label: S26</w:t>
       </w:r>
     </w:p>
     <w:p>
@@ -6616,7 +6687,7 @@
           <w:color w:val="6B7263"/>
           <w:sz w:val="18"/>
         </w:rPr>
-        <w:t>Confused with: Alnus incana (1); M03 (1)</w:t>
+        <w:t>Confused with: MD22 (1); MM12 (1)</w:t>
       </w:r>
     </w:p>
     <w:tbl>
@@ -6965,7 +7036,18 @@
         <w:pStyle w:val="Heading3"/>
       </w:pPr>
       <w:r>
-        <w:t>S01.a.e — Early snowberry shrub-steppe</w:t>
+        <w:t>MD08 — Early snowberry shrub-steppe</w:t>
+      </w:r>
+    </w:p>
+    <w:p>
+      <w:r>
+        <w:rPr>
+          <w:b w:val="0"/>
+          <w:i w:val="0"/>
+          <w:color w:val="6B7263"/>
+          <w:sz w:val="18"/>
+        </w:rPr>
+        <w:t>internal label: S01.a.e</w:t>
       </w:r>
     </w:p>
     <w:p>
@@ -7014,7 +7096,7 @@
           <w:color w:val="6B7263"/>
           <w:sz w:val="18"/>
         </w:rPr>
-        <w:t>Confused with: S01.b (2); S04.b.e (2)</w:t>
+        <w:t>Confused with: MD11 (3); MD05 (1)</w:t>
       </w:r>
     </w:p>
     <w:p>
@@ -7374,7 +7456,18 @@
         <w:pStyle w:val="Heading3"/>
       </w:pPr>
       <w:r>
-        <w:t>S19.e — Early snowberry dry park</w:t>
+        <w:t>MD09 — Early snowberry dry park</w:t>
+      </w:r>
+    </w:p>
+    <w:p>
+      <w:r>
+        <w:rPr>
+          <w:b w:val="0"/>
+          <w:i w:val="0"/>
+          <w:color w:val="6B7263"/>
+          <w:sz w:val="18"/>
+        </w:rPr>
+        <w:t>internal label: S19.e</w:t>
       </w:r>
     </w:p>
     <w:p>
@@ -7396,7 +7489,7 @@
           <w:color w:val="6B7263"/>
           <w:sz w:val="18"/>
         </w:rPr>
-        <w:t>n = 11  (’18/’23/’25/’26: 0/0/9/2)   snow-free DOY 110   joint recall 0.82   bare 7.3%   NPV 29.1%</w:t>
+        <w:t>n = 11  (’18/’23/’25/’26: 0/0/9/2)   snow-free DOY 110   joint recall 0.73   bare 7.3%   NPV 29.1%</w:t>
       </w:r>
     </w:p>
     <w:p>
@@ -7423,7 +7516,7 @@
           <w:color w:val="6B7263"/>
           <w:sz w:val="18"/>
         </w:rPr>
-        <w:t>Confused with: S04.b.e (1); S18 (1)</w:t>
+        <w:t>Confused with: MD13 (2); MD05 (1)</w:t>
       </w:r>
     </w:p>
     <w:p>
@@ -7783,7 +7876,18 @@
         <w:pStyle w:val="Heading3"/>
       </w:pPr>
       <w:r>
-        <w:t>S02.a.e — Early Wyethia meadow</w:t>
+        <w:t>MM10 — Early Wyethia meadow</w:t>
+      </w:r>
+    </w:p>
+    <w:p>
+      <w:r>
+        <w:rPr>
+          <w:b w:val="0"/>
+          <w:i w:val="0"/>
+          <w:color w:val="6B7263"/>
+          <w:sz w:val="18"/>
+        </w:rPr>
+        <w:t>internal label: S02.a.e</w:t>
       </w:r>
     </w:p>
     <w:p>
@@ -7805,7 +7909,7 @@
           <w:color w:val="6B7263"/>
           <w:sz w:val="18"/>
         </w:rPr>
-        <w:t>n = 19  (’18/’23/’25/’26: 0/4/12/3)   snow-free DOY 114   joint recall 0.74   bare 26.6%   NPV 14.5%</w:t>
+        <w:t>n = 19  (’18/’23/’25/’26: 0/4/12/3)   snow-free DOY 114   joint recall 0.84   bare 26.6%   NPV 14.5%</w:t>
       </w:r>
     </w:p>
     <w:p>
@@ -7832,7 +7936,7 @@
           <w:color w:val="6B7263"/>
           <w:sz w:val="18"/>
         </w:rPr>
-        <w:t>Confused with: S02.a.l (2); S01.a.e (1)</w:t>
+        <w:t>Confused with: MD04 (1); MD13 (1)</w:t>
       </w:r>
     </w:p>
     <w:p>
@@ -7862,7 +7966,18 @@
         <w:pStyle w:val="Heading3"/>
       </w:pPr>
       <w:r>
-        <w:t>S10.b — Fleabane-horsemint meadow</w:t>
+        <w:t>MM12 — Fleabane-horsemint meadow</w:t>
+      </w:r>
+    </w:p>
+    <w:p>
+      <w:r>
+        <w:rPr>
+          <w:b w:val="0"/>
+          <w:i w:val="0"/>
+          <w:color w:val="6B7263"/>
+          <w:sz w:val="18"/>
+        </w:rPr>
+        <w:t>internal label: S10.b</w:t>
       </w:r>
     </w:p>
     <w:p>
@@ -7911,7 +8026,7 @@
           <w:color w:val="6B7263"/>
           <w:sz w:val="18"/>
         </w:rPr>
-        <w:t>Confused with: S06.b (3); S10.a (3)</w:t>
+        <w:t>Confused with: MM20 (4); MD08 (1)</w:t>
       </w:r>
     </w:p>
     <w:tbl>
@@ -8100,7 +8215,18 @@
         <w:pStyle w:val="Heading3"/>
       </w:pPr>
       <w:r>
-        <w:t>M04 — Lupine meadow</w:t>
+        <w:t>MD11 — Lupine meadow</w:t>
+      </w:r>
+    </w:p>
+    <w:p>
+      <w:r>
+        <w:rPr>
+          <w:b w:val="0"/>
+          <w:i w:val="0"/>
+          <w:color w:val="6B7263"/>
+          <w:sz w:val="18"/>
+        </w:rPr>
+        <w:t>internal label: M04</w:t>
       </w:r>
     </w:p>
     <w:p>
@@ -8122,7 +8248,7 @@
           <w:color w:val="6B7263"/>
           <w:sz w:val="18"/>
         </w:rPr>
-        <w:t>n = 16  (’18/’23/’25/’26: 0/14/2/0)   snow-free DOY 119   joint recall 0.31   bare 11.2%   NPV 5.3%</w:t>
+        <w:t>n = 16  (’18/’23/’25/’26: 0/14/2/0)   snow-free DOY 119   joint recall 0.19   bare 11.2%   NPV 5.3%</w:t>
       </w:r>
     </w:p>
     <w:p>
@@ -8149,7 +8275,7 @@
           <w:color w:val="6B7263"/>
           <w:sz w:val="18"/>
         </w:rPr>
-        <w:t>Confused with: S01.a.e (2); S01.a.l (2)</w:t>
+        <w:t>Confused with: MD08 (3); MM10 (3)</w:t>
       </w:r>
     </w:p>
     <w:p>
@@ -8509,7 +8635,18 @@
         <w:pStyle w:val="Heading3"/>
       </w:pPr>
       <w:r>
-        <w:t>M03 — Sagebrush-fescue shrubland</w:t>
+        <w:t>MD13 — Sagebrush-fescue shrubland</w:t>
+      </w:r>
+    </w:p>
+    <w:p>
+      <w:r>
+        <w:rPr>
+          <w:b w:val="0"/>
+          <w:i w:val="0"/>
+          <w:color w:val="6B7263"/>
+          <w:sz w:val="18"/>
+        </w:rPr>
+        <w:t>internal label: M03</w:t>
       </w:r>
     </w:p>
     <w:p>
@@ -8531,7 +8668,7 @@
           <w:color w:val="6B7263"/>
           <w:sz w:val="18"/>
         </w:rPr>
-        <w:t>n = 34  (’18/’23/’25/’26: 2/10/12/10)   snow-free DOY 119   joint recall 0.50   bare 4.4%   NPV 23.8%</w:t>
+        <w:t>n = 34  (’18/’23/’25/’26: 2/10/12/10)   snow-free DOY 119   joint recall 0.53   bare 4.4%   NPV 23.8%</w:t>
       </w:r>
     </w:p>
     <w:p>
@@ -8558,7 +8695,7 @@
           <w:color w:val="6B7263"/>
           <w:sz w:val="18"/>
         </w:rPr>
-        <w:t>Confused with: S05.a (5); S04.b.l (4)</w:t>
+        <w:t>Confused with: MD17 (4); MD21 (4)</w:t>
       </w:r>
     </w:p>
     <w:p>
@@ -8918,7 +9055,18 @@
         <w:pStyle w:val="Heading3"/>
       </w:pPr>
       <w:r>
-        <w:t>S01.b — Buckwheat dry meadow</w:t>
+        <w:t>MD14 — Buckwheat dry meadow</w:t>
+      </w:r>
+    </w:p>
+    <w:p>
+      <w:r>
+        <w:rPr>
+          <w:b w:val="0"/>
+          <w:i w:val="0"/>
+          <w:color w:val="6B7263"/>
+          <w:sz w:val="18"/>
+        </w:rPr>
+        <w:t>internal label: S01.b</w:t>
       </w:r>
     </w:p>
     <w:p>
@@ -8929,7 +9077,7 @@
           <w:color w:val="6B7263"/>
           <w:sz w:val="18"/>
         </w:rPr>
-        <w:t>dry · montane · floristic split · needs ancillary · augment: critical</w:t>
+        <w:t>dry · montane · floristic split · needs ancillary · augment: high</w:t>
       </w:r>
     </w:p>
     <w:p>
@@ -8940,7 +9088,7 @@
           <w:color w:val="6B7263"/>
           <w:sz w:val="18"/>
         </w:rPr>
-        <w:t>n = 12  (’18/’23/’25/’26: 0/9/1/2)   snow-free DOY 121   joint recall 0.00   bare 12.9%   NPV 10%</w:t>
+        <w:t>n = 12  (’18/’23/’25/’26: 0/9/1/2)   snow-free DOY 121   joint recall 0.08   bare 12.9%   NPV 10%</w:t>
       </w:r>
     </w:p>
     <w:p>
@@ -8967,7 +9115,7 @@
           <w:color w:val="6B7263"/>
           <w:sz w:val="18"/>
         </w:rPr>
-        <w:t>Confused with: S01.a.l (5); S01.a.e (4)</w:t>
+        <w:t>Confused with: MD23 (3); MD13 (2)</w:t>
       </w:r>
     </w:p>
     <w:tbl>
@@ -9316,7 +9464,18 @@
         <w:pStyle w:val="Heading3"/>
       </w:pPr>
       <w:r>
-        <w:t>S02.b — Lathyrus meadow</w:t>
+        <w:t>MM16 — Lathyrus meadow</w:t>
+      </w:r>
+    </w:p>
+    <w:p>
+      <w:r>
+        <w:rPr>
+          <w:b w:val="0"/>
+          <w:i w:val="0"/>
+          <w:color w:val="6B7263"/>
+          <w:sz w:val="18"/>
+        </w:rPr>
+        <w:t>internal label: S02.b</w:t>
       </w:r>
     </w:p>
     <w:p>
@@ -9365,7 +9524,7 @@
           <w:color w:val="6B7263"/>
           <w:sz w:val="18"/>
         </w:rPr>
-        <w:t>Confused with: S02.a.l (5); S02.a.e (2)</w:t>
+        <w:t>Confused with: MM26 (5); MM10 (3)</w:t>
       </w:r>
     </w:p>
     <w:tbl>
@@ -9714,7 +9873,18 @@
         <w:pStyle w:val="Heading3"/>
       </w:pPr>
       <w:r>
-        <w:t>S04.a — Thurber fescue grassland</w:t>
+        <w:t>MD15 — Thurber fescue grassland</w:t>
+      </w:r>
+    </w:p>
+    <w:p>
+      <w:r>
+        <w:rPr>
+          <w:b w:val="0"/>
+          <w:i w:val="0"/>
+          <w:color w:val="6B7263"/>
+          <w:sz w:val="18"/>
+        </w:rPr>
+        <w:t>internal label: S04.a</w:t>
       </w:r>
     </w:p>
     <w:p>
@@ -9763,7 +9933,7 @@
           <w:color w:val="6B7263"/>
           <w:sz w:val="18"/>
         </w:rPr>
-        <w:t>Confused with: M03 (4); S04.b.l (3)</w:t>
+        <w:t>Confused with: MD13 (4); MD21 (4)</w:t>
       </w:r>
     </w:p>
     <w:tbl>
@@ -10112,7 +10282,18 @@
         <w:pStyle w:val="Heading3"/>
       </w:pPr>
       <w:r>
-        <w:t>S22 — Senescent sagebrush park</w:t>
+        <w:t>MD18 — Senescent sagebrush park</w:t>
+      </w:r>
+    </w:p>
+    <w:p>
+      <w:r>
+        <w:rPr>
+          <w:b w:val="0"/>
+          <w:i w:val="0"/>
+          <w:color w:val="6B7263"/>
+          <w:sz w:val="18"/>
+        </w:rPr>
+        <w:t>internal label: S22</w:t>
       </w:r>
     </w:p>
     <w:p>
@@ -10134,7 +10315,7 @@
           <w:color w:val="6B7263"/>
           <w:sz w:val="18"/>
         </w:rPr>
-        <w:t>n = 17  (’18/’23/’25/’26: 0/2/5/10)   snow-free DOY 126   joint recall 0.88   bare 7.1%   NPV 41.2%</w:t>
+        <w:t>n = 17  (’18/’23/’25/’26: 0/2/5/10)   snow-free DOY 126   joint recall 0.94   bare 7.1%   NPV 41.2%</w:t>
       </w:r>
     </w:p>
     <w:p>
@@ -10499,7 +10680,18 @@
         <w:pStyle w:val="Heading3"/>
       </w:pPr>
       <w:r>
-        <w:t>S05.a — Silver-sage sedge park</w:t>
+        <w:t>MD17 — Silver-sage sedge park</w:t>
+      </w:r>
+    </w:p>
+    <w:p>
+      <w:r>
+        <w:rPr>
+          <w:b w:val="0"/>
+          <w:i w:val="0"/>
+          <w:color w:val="6B7263"/>
+          <w:sz w:val="18"/>
+        </w:rPr>
+        <w:t>internal label: S05.a</w:t>
       </w:r>
     </w:p>
     <w:p>
@@ -10521,7 +10713,7 @@
           <w:color w:val="6B7263"/>
           <w:sz w:val="18"/>
         </w:rPr>
-        <w:t>n = 24  (’18/’23/’25/’26: 1/8/9/6)   snow-free DOY 126   joint recall 0.75   bare 4.8%   NPV 29.6%</w:t>
+        <w:t>n = 24  (’18/’23/’25/’26: 1/8/9/6)   snow-free DOY 126   joint recall 0.83   bare 4.8%   NPV 29.6%</w:t>
       </w:r>
     </w:p>
     <w:p>
@@ -10548,7 +10740,7 @@
           <w:color w:val="6B7263"/>
           <w:sz w:val="18"/>
         </w:rPr>
-        <w:t>Confused with: M03 (6)</w:t>
+        <w:t>Confused with: MD13 (4); MD14 (1)</w:t>
       </w:r>
     </w:p>
     <w:tbl>
@@ -10897,7 +11089,18 @@
         <w:pStyle w:val="Heading3"/>
       </w:pPr>
       <w:r>
-        <w:t>S11 — Wyethia swale meadow</w:t>
+        <w:t>MM19 — Wyethia swale meadow</w:t>
+      </w:r>
+    </w:p>
+    <w:p>
+      <w:r>
+        <w:rPr>
+          <w:b w:val="0"/>
+          <w:i w:val="0"/>
+          <w:color w:val="6B7263"/>
+          <w:sz w:val="18"/>
+        </w:rPr>
+        <w:t>internal label: S11</w:t>
       </w:r>
     </w:p>
     <w:p>
@@ -10965,7 +11168,18 @@
         <w:pStyle w:val="Heading3"/>
       </w:pPr>
       <w:r>
-        <w:t>S10.a — Snowberry mesic meadow</w:t>
+        <w:t>MM20 — Snowberry mesic meadow</w:t>
+      </w:r>
+    </w:p>
+    <w:p>
+      <w:r>
+        <w:rPr>
+          <w:b w:val="0"/>
+          <w:i w:val="0"/>
+          <w:color w:val="6B7263"/>
+          <w:sz w:val="18"/>
+        </w:rPr>
+        <w:t>internal label: S10.a</w:t>
       </w:r>
     </w:p>
     <w:p>
@@ -10987,7 +11201,7 @@
           <w:color w:val="6B7263"/>
           <w:sz w:val="18"/>
         </w:rPr>
-        <w:t>n = 26  (’18/’23/’25/’26: 1/16/9/0)   snow-free DOY 128   joint recall 0.54   bare 5.8%   NPV NA%</w:t>
+        <w:t>n = 26  (’18/’23/’25/’26: 1/16/9/0)   snow-free DOY 128   joint recall 0.73   bare 5.8%   NPV NA%</w:t>
       </w:r>
     </w:p>
     <w:p>
@@ -11014,7 +11228,7 @@
           <w:color w:val="6B7263"/>
           <w:sz w:val="18"/>
         </w:rPr>
-        <w:t>Confused with: S10.c (4); S06.b (2)</w:t>
+        <w:t>Confused with: MM25 (3); MM12 (2)</w:t>
       </w:r>
     </w:p>
     <w:tbl>
@@ -11283,7 +11497,18 @@
         <w:pStyle w:val="Heading3"/>
       </w:pPr>
       <w:r>
-        <w:t>S04.b.l — Lathyrus-buckwheat meadow</w:t>
+        <w:t>MD21 — Lathyrus-buckwheat meadow</w:t>
+      </w:r>
+    </w:p>
+    <w:p>
+      <w:r>
+        <w:rPr>
+          <w:b w:val="0"/>
+          <w:i w:val="0"/>
+          <w:color w:val="6B7263"/>
+          <w:sz w:val="18"/>
+        </w:rPr>
+        <w:t>internal label: S04.b.l</w:t>
       </w:r>
     </w:p>
     <w:p>
@@ -11305,7 +11530,7 @@
           <w:color w:val="6B7263"/>
           <w:sz w:val="18"/>
         </w:rPr>
-        <w:t>n = 21  (’18/’23/’25/’26: 10/7/4/0)   snow-free DOY 131   joint recall 0.48   bare NA%   NPV 8.8%</w:t>
+        <w:t>n = 21  (’18/’23/’25/’26: 10/7/4/0)   snow-free DOY 131   joint recall 0.52   bare NA%   NPV 8.8%</w:t>
       </w:r>
     </w:p>
     <w:p>
@@ -11332,7 +11557,7 @@
           <w:color w:val="6B7263"/>
           <w:sz w:val="18"/>
         </w:rPr>
-        <w:t>Confused with: M03 (2); S01.a.l (2)</w:t>
+        <w:t>Confused with: MD13 (3); SM28 (2)</w:t>
       </w:r>
     </w:p>
     <w:p>
@@ -11532,7 +11757,18 @@
         <w:pStyle w:val="Heading3"/>
       </w:pPr>
       <w:r>
-        <w:t>S19.l — Oxytropis grass park</w:t>
+        <w:t>MD22 — Oxytropis grass park</w:t>
+      </w:r>
+    </w:p>
+    <w:p>
+      <w:r>
+        <w:rPr>
+          <w:b w:val="0"/>
+          <w:i w:val="0"/>
+          <w:color w:val="6B7263"/>
+          <w:sz w:val="18"/>
+        </w:rPr>
+        <w:t>internal label: S19.l</w:t>
       </w:r>
     </w:p>
     <w:p>
@@ -11581,7 +11817,7 @@
           <w:color w:val="6B7263"/>
           <w:sz w:val="18"/>
         </w:rPr>
-        <w:t>Confused with: S05.a (2); S01.a.l (1)</w:t>
+        <w:t>Confused with: MD17 (2); MD21 (1)</w:t>
       </w:r>
     </w:p>
     <w:p>
@@ -11861,7 +12097,18 @@
         <w:pStyle w:val="Heading3"/>
       </w:pPr>
       <w:r>
-        <w:t>S01.a.l — Montane shrub-meadow</w:t>
+        <w:t>MD23 — Montane shrub-meadow</w:t>
+      </w:r>
+    </w:p>
+    <w:p>
+      <w:r>
+        <w:rPr>
+          <w:b w:val="0"/>
+          <w:i w:val="0"/>
+          <w:color w:val="6B7263"/>
+          <w:sz w:val="18"/>
+        </w:rPr>
+        <w:t>internal label: S01.a.l</w:t>
       </w:r>
     </w:p>
     <w:p>
@@ -11883,7 +12130,7 @@
           <w:color w:val="6B7263"/>
           <w:sz w:val="18"/>
         </w:rPr>
-        <w:t>n = 31  (’18/’23/’25/’26: 3/19/9/0)   snow-free DOY 133   joint recall 0.74   bare 10.2%   NPV 14.5%</w:t>
+        <w:t>n = 31  (’18/’23/’25/’26: 3/19/9/0)   snow-free DOY 133   joint recall 0.61   bare 10.2%   NPV 14.5%</w:t>
       </w:r>
     </w:p>
     <w:p>
@@ -11910,7 +12157,7 @@
           <w:color w:val="6B7263"/>
           <w:sz w:val="18"/>
         </w:rPr>
-        <w:t>Confused with: S06.b (3); S02.a.l (2)</w:t>
+        <w:t>Confused with: SM28 (3); MM26 (2)</w:t>
       </w:r>
     </w:p>
     <w:p>
@@ -11940,7 +12187,18 @@
         <w:pStyle w:val="Heading3"/>
       </w:pPr>
       <w:r>
-        <w:t>S20 — Rocky buckwheat barren</w:t>
+        <w:t>MD24 — Rocky buckwheat barren</w:t>
+      </w:r>
+    </w:p>
+    <w:p>
+      <w:r>
+        <w:rPr>
+          <w:b w:val="0"/>
+          <w:i w:val="0"/>
+          <w:color w:val="6B7263"/>
+          <w:sz w:val="18"/>
+        </w:rPr>
+        <w:t>internal label: S20</w:t>
       </w:r>
     </w:p>
     <w:p>
@@ -12327,7 +12585,18 @@
         <w:pStyle w:val="Heading3"/>
       </w:pPr>
       <w:r>
-        <w:t>S10.c — Cinquefoil-paintbrush meadow</w:t>
+        <w:t>MM25 — Cinquefoil-paintbrush meadow</w:t>
+      </w:r>
+    </w:p>
+    <w:p>
+      <w:r>
+        <w:rPr>
+          <w:b w:val="0"/>
+          <w:i w:val="0"/>
+          <w:color w:val="6B7263"/>
+          <w:sz w:val="18"/>
+        </w:rPr>
+        <w:t>internal label: S10.c</w:t>
       </w:r>
     </w:p>
     <w:p>
@@ -12349,7 +12618,7 @@
           <w:color w:val="6B7263"/>
           <w:sz w:val="18"/>
         </w:rPr>
-        <w:t>n = 10  (’18/’23/’25/’26: 0/5/5/0)   snow-free DOY 137   joint recall 0.00   bare NA%   NPV 11%</w:t>
+        <w:t>n = 10  (’18/’23/’25/’26: 0/5/5/0)   snow-free DOY 137   joint recall 0.10   bare NA%   NPV 11%</w:t>
       </w:r>
     </w:p>
     <w:p>
@@ -12376,7 +12645,7 @@
           <w:color w:val="6B7263"/>
           <w:sz w:val="18"/>
         </w:rPr>
-        <w:t>Confused with: S10.a (6); S15 (1)</w:t>
+        <w:t>Confused with: MM20 (8); MD22 (1)</w:t>
       </w:r>
     </w:p>
     <w:tbl>
@@ -12565,7 +12834,18 @@
         <w:pStyle w:val="Heading3"/>
       </w:pPr>
       <w:r>
-        <w:t>S02.a.l — Fescue tall-forb meadow</w:t>
+        <w:t>MM26 — Fescue tall-forb meadow</w:t>
+      </w:r>
+    </w:p>
+    <w:p>
+      <w:r>
+        <w:rPr>
+          <w:b w:val="0"/>
+          <w:i w:val="0"/>
+          <w:color w:val="6B7263"/>
+          <w:sz w:val="18"/>
+        </w:rPr>
+        <w:t>internal label: S02.a.l</w:t>
       </w:r>
     </w:p>
     <w:p>
@@ -12587,7 +12867,7 @@
           <w:color w:val="6B7263"/>
           <w:sz w:val="18"/>
         </w:rPr>
-        <w:t>n = 28  (’18/’23/’25/’26: 7/5/16/0)   snow-free DOY 139   joint recall 0.79   bare 9.8%   NPV 20.2%</w:t>
+        <w:t>n = 28  (’18/’23/’25/’26: 7/5/16/0)   snow-free DOY 139   joint recall 0.75   bare 9.8%   NPV 20.2%</w:t>
       </w:r>
     </w:p>
     <w:p>
@@ -12614,7 +12894,7 @@
           <w:color w:val="6B7263"/>
           <w:sz w:val="18"/>
         </w:rPr>
-        <w:t>Confused with: M02 (1); S01.a.l (1)</w:t>
+        <w:t>Confused with: SM28 (4); MD23 (1)</w:t>
       </w:r>
     </w:p>
     <w:p>
@@ -12982,7 +13262,18 @@
         <w:pStyle w:val="Heading3"/>
       </w:pPr>
       <w:r>
-        <w:t>Osmorhiza occidentalis — Sweet-cicely stand</w:t>
+        <w:t>SM27 — Sweet-cicely stand</w:t>
+      </w:r>
+    </w:p>
+    <w:p>
+      <w:r>
+        <w:rPr>
+          <w:b w:val="0"/>
+          <w:i w:val="0"/>
+          <w:color w:val="6B7263"/>
+          <w:sz w:val="18"/>
+        </w:rPr>
+        <w:t>internal label: Osmorhiza occidentalis</w:t>
       </w:r>
     </w:p>
     <w:p>
@@ -13031,7 +13322,7 @@
           <w:color w:val="6B7263"/>
           <w:sz w:val="18"/>
         </w:rPr>
-        <w:t>Confused with: M02 (4); S06.b (2)</w:t>
+        <w:t>Confused with: SM35 (4); SM28 (3)</w:t>
       </w:r>
     </w:p>
     <w:p>
@@ -13061,7 +13352,18 @@
         <w:pStyle w:val="Heading3"/>
       </w:pPr>
       <w:r>
-        <w:t>S06.b — Subalpine mixed meadow</w:t>
+        <w:t>SM28 — Subalpine mixed meadow</w:t>
+      </w:r>
+    </w:p>
+    <w:p>
+      <w:r>
+        <w:rPr>
+          <w:b w:val="0"/>
+          <w:i w:val="0"/>
+          <w:color w:val="6B7263"/>
+          <w:sz w:val="18"/>
+        </w:rPr>
+        <w:t>internal label: S06.b</w:t>
       </w:r>
     </w:p>
     <w:p>
@@ -13083,7 +13385,7 @@
           <w:color w:val="6B7263"/>
           <w:sz w:val="18"/>
         </w:rPr>
-        <w:t>n = 83  (’18/’23/’25/’26: 25/15/42/1)   snow-free DOY 143   joint recall 0.77   bare 16.4%   NPV 12%</w:t>
+        <w:t>n = 83  (’18/’23/’25/’26: 25/15/42/1)   snow-free DOY 143   joint recall 0.78   bare 16.4%   NPV 12%</w:t>
       </w:r>
     </w:p>
     <w:p>
@@ -13110,7 +13412,7 @@
           <w:color w:val="6B7263"/>
           <w:sz w:val="18"/>
         </w:rPr>
-        <w:t>Confused with: M02 (9); M01 (3)</w:t>
+        <w:t>Confused with: SM35 (7); AW43 (2)</w:t>
       </w:r>
     </w:p>
     <w:tbl>
@@ -13299,7 +13601,18 @@
         <w:pStyle w:val="Heading3"/>
       </w:pPr>
       <w:r>
-        <w:t>Veratrum tenuipetalum — Corn-lily meadow</w:t>
+        <w:t>SW29 — Corn-lily meadow</w:t>
+      </w:r>
+    </w:p>
+    <w:p>
+      <w:r>
+        <w:rPr>
+          <w:b w:val="0"/>
+          <w:i w:val="0"/>
+          <w:color w:val="6B7263"/>
+          <w:sz w:val="18"/>
+        </w:rPr>
+        <w:t>internal label: Veratrum tenuipetalum</w:t>
       </w:r>
     </w:p>
     <w:p>
@@ -13321,7 +13634,7 @@
           <w:color w:val="6B7263"/>
           <w:sz w:val="18"/>
         </w:rPr>
-        <w:t>n = 19  (’18/’23/’25/’26: 12/2/5/0)   snow-free DOY 144   joint recall 0.32   bare 0.3%   NPV 3.4%</w:t>
+        <w:t>n = 19  (’18/’23/’25/’26: 12/2/5/0)   snow-free DOY 144   joint recall 0.26   bare 0.3%   NPV 3.4%</w:t>
       </w:r>
     </w:p>
     <w:p>
@@ -13348,7 +13661,7 @@
           <w:color w:val="6B7263"/>
           <w:sz w:val="18"/>
         </w:rPr>
-        <w:t>Confused with: S03 (6); M02 (3)</w:t>
+        <w:t>Confused with: SW36 (8); SM35 (2)</w:t>
       </w:r>
     </w:p>
     <w:tbl>
@@ -13697,7 +14010,18 @@
         <w:pStyle w:val="Heading3"/>
       </w:pPr>
       <w:r>
-        <w:t>S23 — Subalpine forb turf</w:t>
+        <w:t>SM30 — Subalpine forb turf</w:t>
+      </w:r>
+    </w:p>
+    <w:p>
+      <w:r>
+        <w:rPr>
+          <w:b w:val="0"/>
+          <w:i w:val="0"/>
+          <w:color w:val="6B7263"/>
+          <w:sz w:val="18"/>
+        </w:rPr>
+        <w:t>internal label: S23</w:t>
       </w:r>
     </w:p>
     <w:p>
@@ -14084,7 +14408,18 @@
         <w:pStyle w:val="Heading3"/>
       </w:pPr>
       <w:r>
-        <w:t>Ligusticum porteri — Osha tall-forb stand</w:t>
+        <w:t>SW31 — Osha tall-forb stand</w:t>
+      </w:r>
+    </w:p>
+    <w:p>
+      <w:r>
+        <w:rPr>
+          <w:b w:val="0"/>
+          <w:i w:val="0"/>
+          <w:color w:val="6B7263"/>
+          <w:sz w:val="18"/>
+        </w:rPr>
+        <w:t>internal label: Ligusticum porteri</w:t>
       </w:r>
     </w:p>
     <w:p>
@@ -14133,7 +14468,7 @@
           <w:color w:val="6B7263"/>
           <w:sz w:val="18"/>
         </w:rPr>
-        <w:t>Confused with: M02 (7); S06.b (3)</w:t>
+        <w:t>Confused with: SM35 (9); SM28 (2)</w:t>
       </w:r>
     </w:p>
     <w:tbl>
@@ -14402,7 +14737,18 @@
         <w:pStyle w:val="Heading3"/>
       </w:pPr>
       <w:r>
-        <w:t>S15 — Wet sedge meadow</w:t>
+        <w:t>SW32 — Wet sedge meadow</w:t>
+      </w:r>
+    </w:p>
+    <w:p>
+      <w:r>
+        <w:rPr>
+          <w:b w:val="0"/>
+          <w:i w:val="0"/>
+          <w:color w:val="6B7263"/>
+          <w:sz w:val="18"/>
+        </w:rPr>
+        <w:t>internal label: S15</w:t>
       </w:r>
     </w:p>
     <w:p>
@@ -14424,7 +14770,7 @@
           <w:color w:val="6B7263"/>
           <w:sz w:val="18"/>
         </w:rPr>
-        <w:t>n = 16  (’18/’23/’25/’26: 2/2/12/0)   snow-free DOY 147   joint recall 0.62   bare NA%   NPV 14.4%</w:t>
+        <w:t>n = 16  (’18/’23/’25/’26: 2/2/12/0)   snow-free DOY 147   joint recall 0.75   bare NA%   NPV 14.4%</w:t>
       </w:r>
     </w:p>
     <w:p>
@@ -14451,7 +14797,7 @@
           <w:color w:val="6B7263"/>
           <w:sz w:val="18"/>
         </w:rPr>
-        <w:t>Confused with: S14 (2); S01.a.l (1)</w:t>
+        <w:t>Confused with: AW43 (2); Dasiphora fruticosa (1)</w:t>
       </w:r>
     </w:p>
     <w:p>
@@ -14811,7 +15157,18 @@
         <w:pStyle w:val="Heading3"/>
       </w:pPr>
       <w:r>
-        <w:t>S08.a.e — Helianthella subalpine meadow</w:t>
+        <w:t>SM33 — Helianthella subalpine meadow</w:t>
+      </w:r>
+    </w:p>
+    <w:p>
+      <w:r>
+        <w:rPr>
+          <w:b w:val="0"/>
+          <w:i w:val="0"/>
+          <w:color w:val="6B7263"/>
+          <w:sz w:val="18"/>
+        </w:rPr>
+        <w:t>internal label: S08.a.e</w:t>
       </w:r>
     </w:p>
     <w:p>
@@ -14833,7 +15190,7 @@
           <w:color w:val="6B7263"/>
           <w:sz w:val="18"/>
         </w:rPr>
-        <w:t>n = 14  (’18/’23/’25/’26: 13/1/0/0)   snow-free DOY 148   joint recall 0.64   bare 11.8%   NPV 8.9%</w:t>
+        <w:t>n = 14  (’18/’23/’25/’26: 13/1/0/0)   snow-free DOY 148   joint recall 0.43   bare 11.8%   NPV 8.9%</w:t>
       </w:r>
     </w:p>
     <w:p>
@@ -14860,7 +15217,7 @@
           <w:color w:val="6B7263"/>
           <w:sz w:val="18"/>
         </w:rPr>
-        <w:t>Confused with: M02 (4); S06.b (1)</w:t>
+        <w:t>Confused with: SM35 (7); SM28 (1)</w:t>
       </w:r>
     </w:p>
     <w:p>
@@ -15220,7 +15577,18 @@
         <w:pStyle w:val="Heading3"/>
       </w:pPr>
       <w:r>
-        <w:t>S09.a — Lathyrus mesic meadow</w:t>
+        <w:t>SM34 — Lathyrus mesic meadow</w:t>
+      </w:r>
+    </w:p>
+    <w:p>
+      <w:r>
+        <w:rPr>
+          <w:b w:val="0"/>
+          <w:i w:val="0"/>
+          <w:color w:val="6B7263"/>
+          <w:sz w:val="18"/>
+        </w:rPr>
+        <w:t>internal label: S09.a</w:t>
       </w:r>
     </w:p>
     <w:p>
@@ -15242,7 +15610,7 @@
           <w:color w:val="6B7263"/>
           <w:sz w:val="18"/>
         </w:rPr>
-        <w:t>n = 19  (’18/’23/’25/’26: 15/3/1/0)   snow-free DOY 149   joint recall 0.79   bare 6.6%   NPV 7.1%</w:t>
+        <w:t>n = 19  (’18/’23/’25/’26: 15/3/1/0)   snow-free DOY 149   joint recall 0.74   bare 6.6%   NPV 7.1%</w:t>
       </w:r>
     </w:p>
     <w:p>
@@ -15269,7 +15637,7 @@
           <w:color w:val="6B7263"/>
           <w:sz w:val="18"/>
         </w:rPr>
-        <w:t>Confused with: M02 (3); S06.b (1)</w:t>
+        <w:t>Confused with: SM28 (2); SM35 (2)</w:t>
       </w:r>
     </w:p>
     <w:p>
@@ -15549,7 +15917,18 @@
         <w:pStyle w:val="Heading3"/>
       </w:pPr>
       <w:r>
-        <w:t>M02 — Osha tall-forb meadow</w:t>
+        <w:t>SM35 — Osha tall-forb meadow</w:t>
+      </w:r>
+    </w:p>
+    <w:p>
+      <w:r>
+        <w:rPr>
+          <w:b w:val="0"/>
+          <w:i w:val="0"/>
+          <w:color w:val="6B7263"/>
+          <w:sz w:val="18"/>
+        </w:rPr>
+        <w:t>internal label: M02</w:t>
       </w:r>
     </w:p>
     <w:p>
@@ -15571,7 +15950,7 @@
           <w:color w:val="6B7263"/>
           <w:sz w:val="18"/>
         </w:rPr>
-        <w:t>n = 49  (’18/’23/’25/’26: 31/7/11/0)   snow-free DOY 150   joint recall 0.43   bare 6.5%   NPV 8.7%</w:t>
+        <w:t>n = 49  (’18/’23/’25/’26: 31/7/11/0)   snow-free DOY 150   joint recall 0.39   bare 6.5%   NPV 8.7%</w:t>
       </w:r>
     </w:p>
     <w:p>
@@ -15598,7 +15977,7 @@
           <w:color w:val="6B7263"/>
           <w:sz w:val="18"/>
         </w:rPr>
-        <w:t>Confused with: S06.b (9); S09.a (5)</w:t>
+        <w:t>Confused with: SM28 (9); SM33 (5)</w:t>
       </w:r>
     </w:p>
     <w:p>
@@ -15958,7 +16337,18 @@
         <w:pStyle w:val="Heading3"/>
       </w:pPr>
       <w:r>
-        <w:t>S03 — Tall-forb wet meadow</w:t>
+        <w:t>SW36 — Tall-forb wet meadow</w:t>
+      </w:r>
+    </w:p>
+    <w:p>
+      <w:r>
+        <w:rPr>
+          <w:b w:val="0"/>
+          <w:i w:val="0"/>
+          <w:color w:val="6B7263"/>
+          <w:sz w:val="18"/>
+        </w:rPr>
+        <w:t>internal label: S03</w:t>
       </w:r>
     </w:p>
     <w:p>
@@ -15980,7 +16370,7 @@
           <w:color w:val="6B7263"/>
           <w:sz w:val="18"/>
         </w:rPr>
-        <w:t>n = 22  (’18/’23/’25/’26: 9/3/10/0)   snow-free DOY 151   joint recall 0.68   bare NA%   NPV 1.8%</w:t>
+        <w:t>n = 22  (’18/’23/’25/’26: 9/3/10/0)   snow-free DOY 151   joint recall 0.73   bare NA%   NPV 1.8%</w:t>
       </w:r>
     </w:p>
     <w:p>
@@ -16007,7 +16397,7 @@
           <w:color w:val="6B7263"/>
           <w:sz w:val="18"/>
         </w:rPr>
-        <w:t>Confused with: Veratrum tenuipetalum (7); Ligusticum porteri (1)</w:t>
+        <w:t>Confused with: SW29 (5); SM35 (1)</w:t>
       </w:r>
     </w:p>
     <w:tbl>
@@ -16356,7 +16746,18 @@
         <w:pStyle w:val="Heading3"/>
       </w:pPr>
       <w:r>
-        <w:t>Corydalis caseana — Fitweed seep stand</w:t>
+        <w:t>SW37 — Fitweed seep stand</w:t>
+      </w:r>
+    </w:p>
+    <w:p>
+      <w:r>
+        <w:rPr>
+          <w:b w:val="0"/>
+          <w:i w:val="0"/>
+          <w:color w:val="6B7263"/>
+          <w:sz w:val="18"/>
+        </w:rPr>
+        <w:t>internal label: Corydalis caseana</w:t>
       </w:r>
     </w:p>
     <w:p>
@@ -16367,7 +16768,7 @@
           <w:color w:val="6B7263"/>
           <w:sz w:val="18"/>
         </w:rPr>
-        <w:t>wet · subalpine · augment: critical</w:t>
+        <w:t>wet · subalpine · augment: high</w:t>
       </w:r>
     </w:p>
     <w:p>
@@ -16405,7 +16806,7 @@
           <w:color w:val="6B7263"/>
           <w:sz w:val="18"/>
         </w:rPr>
-        <w:t>Confused with: S03 (2); S07 (2)</w:t>
+        <w:t>Confused with: AW44 (2); SW36 (2)</w:t>
       </w:r>
     </w:p>
     <w:tbl>
@@ -16594,7 +16995,18 @@
         <w:pStyle w:val="Heading3"/>
       </w:pPr>
       <w:r>
-        <w:t>S13.b — Lupine-bilberry slope</w:t>
+        <w:t>SM38 — Lupine-bilberry slope</w:t>
+      </w:r>
+    </w:p>
+    <w:p>
+      <w:r>
+        <w:rPr>
+          <w:b w:val="0"/>
+          <w:i w:val="0"/>
+          <w:color w:val="6B7263"/>
+          <w:sz w:val="18"/>
+        </w:rPr>
+        <w:t>internal label: S13.b</w:t>
       </w:r>
     </w:p>
     <w:p>
@@ -16643,7 +17055,7 @@
           <w:color w:val="6B7263"/>
           <w:sz w:val="18"/>
         </w:rPr>
-        <w:t>Confused with: M01 (5); S15 (2)</w:t>
+        <w:t>Confused with: SM40 (4); SW32 (2)</w:t>
       </w:r>
     </w:p>
     <w:tbl>
@@ -16992,7 +17404,18 @@
         <w:pStyle w:val="Heading3"/>
       </w:pPr>
       <w:r>
-        <w:t>Caltha leptosepala — Marsh-marigold snowbed</w:t>
+        <w:t>SW39 — Marsh-marigold snowbed</w:t>
+      </w:r>
+    </w:p>
+    <w:p>
+      <w:r>
+        <w:rPr>
+          <w:b w:val="0"/>
+          <w:i w:val="0"/>
+          <w:color w:val="6B7263"/>
+          <w:sz w:val="18"/>
+        </w:rPr>
+        <w:t>internal label: Caltha leptosepala</w:t>
       </w:r>
     </w:p>
     <w:p>
@@ -17041,7 +17464,7 @@
           <w:color w:val="6B7263"/>
           <w:sz w:val="18"/>
         </w:rPr>
-        <w:t>Confused with: S07 (3); S06.b (2)</w:t>
+        <w:t>Confused with: AW44 (3); MM19 (1)</w:t>
       </w:r>
     </w:p>
     <w:tbl>
@@ -17390,7 +17813,18 @@
         <w:pStyle w:val="Heading3"/>
       </w:pPr>
       <w:r>
-        <w:t>M01 — Bilberry heath</w:t>
+        <w:t>SM40 — Bilberry heath</w:t>
+      </w:r>
+    </w:p>
+    <w:p>
+      <w:r>
+        <w:rPr>
+          <w:b w:val="0"/>
+          <w:i w:val="0"/>
+          <w:color w:val="6B7263"/>
+          <w:sz w:val="18"/>
+        </w:rPr>
+        <w:t>internal label: M01</w:t>
       </w:r>
     </w:p>
     <w:p>
@@ -17439,7 +17873,7 @@
           <w:color w:val="6B7263"/>
           <w:sz w:val="18"/>
         </w:rPr>
-        <w:t>Confused with: S06.b (6); S20 (1)</w:t>
+        <w:t>Confused with: SM28 (5); MD24 (1)</w:t>
       </w:r>
     </w:p>
     <w:p>
@@ -17799,7 +18233,18 @@
         <w:pStyle w:val="Heading3"/>
       </w:pPr>
       <w:r>
-        <w:t>S21 — Brome disturbed meadow</w:t>
+        <w:t>SM41 — Brome disturbed meadow</w:t>
+      </w:r>
+    </w:p>
+    <w:p>
+      <w:r>
+        <w:rPr>
+          <w:b w:val="0"/>
+          <w:i w:val="0"/>
+          <w:color w:val="6B7263"/>
+          <w:sz w:val="18"/>
+        </w:rPr>
+        <w:t>internal label: S21</w:t>
       </w:r>
     </w:p>
     <w:p>
@@ -17821,7 +18266,7 @@
           <w:color w:val="6B7263"/>
           <w:sz w:val="18"/>
         </w:rPr>
-        <w:t>n = 14  (’18/’23/’25/’26: 0/1/13/0)   snow-free DOY 166   joint recall 0.64   bare 21.4%   NPV 13.6%</w:t>
+        <w:t>n = 14  (’18/’23/’25/’26: 0/1/13/0)   snow-free DOY 166   joint recall 0.86   bare 21.4%   NPV 13.6%</w:t>
       </w:r>
     </w:p>
     <w:p>
@@ -17840,17 +18285,6 @@
         <w:t>Indicators: Chamaenerion angustifolium (3.6%, IV 9.0); Erigeron elatior (0.7%, IV 4.5); Bromopsis inermis (5.7%, IV 3.5); Erigeron grandiflorus (0.7%, IV 2.3); Hymenoxys hoopesii (2.1%, IV 1.8)</w:t>
       </w:r>
     </w:p>
-    <w:p>
-      <w:r>
-        <w:rPr>
-          <w:b w:val="0"/>
-          <w:i w:val="0"/>
-          <w:color w:val="6B7263"/>
-          <w:sz w:val="18"/>
-        </w:rPr>
-        <w:t>Confused with: M02 (1); S03 (1)</w:t>
-      </w:r>
-    </w:p>
     <w:tbl>
       <w:tblPr>
         <w:tblStyle w:val="TableGrid"/>
@@ -18197,7 +18631,18 @@
         <w:pStyle w:val="Heading3"/>
       </w:pPr>
       <w:r>
-        <w:t>S12 — Rocky sparse forb slope</w:t>
+        <w:t>SD42 — Rocky sparse forb slope</w:t>
+      </w:r>
+    </w:p>
+    <w:p>
+      <w:r>
+        <w:rPr>
+          <w:b w:val="0"/>
+          <w:i w:val="0"/>
+          <w:color w:val="6B7263"/>
+          <w:sz w:val="18"/>
+        </w:rPr>
+        <w:t>internal label: S12</w:t>
       </w:r>
     </w:p>
     <w:p>
@@ -18584,7 +19029,18 @@
         <w:pStyle w:val="Heading3"/>
       </w:pPr>
       <w:r>
-        <w:t>S08.a.l — Late Deschampsia meadow</w:t>
+        <w:t>SM45 — Late Deschampsia meadow</w:t>
+      </w:r>
+    </w:p>
+    <w:p>
+      <w:r>
+        <w:rPr>
+          <w:b w:val="0"/>
+          <w:i w:val="0"/>
+          <w:color w:val="6B7263"/>
+          <w:sz w:val="18"/>
+        </w:rPr>
+        <w:t>internal label: S08.a.l</w:t>
       </w:r>
     </w:p>
     <w:p>
@@ -18606,7 +19062,7 @@
           <w:color w:val="6B7263"/>
           <w:sz w:val="18"/>
         </w:rPr>
-        <w:t>n = 16  (’18/’23/’25/’26: 5/4/7/0)   snow-free DOY 172   joint recall 0.62   bare 7.8%   NPV 13.1%</w:t>
+        <w:t>n = 16  (’18/’23/’25/’26: 5/4/7/0)   snow-free DOY 172   joint recall 0.69   bare 7.8%   NPV 13.1%</w:t>
       </w:r>
     </w:p>
     <w:p>
@@ -18633,7 +19089,7 @@
           <w:color w:val="6B7263"/>
           <w:sz w:val="18"/>
         </w:rPr>
-        <w:t>Confused with: M02 (1); S02.a.l (1)</w:t>
+        <w:t>Confused with: SM35 (2); AW44 (1)</w:t>
       </w:r>
     </w:p>
     <w:p>
@@ -19001,7 +19457,18 @@
         <w:pStyle w:val="Heading3"/>
       </w:pPr>
       <w:r>
-        <w:t>S14 — Alpine wet graminoid turf</w:t>
+        <w:t>AW43 — Alpine wet graminoid turf</w:t>
+      </w:r>
+    </w:p>
+    <w:p>
+      <w:r>
+        <w:rPr>
+          <w:b w:val="0"/>
+          <w:i w:val="0"/>
+          <w:color w:val="6B7263"/>
+          <w:sz w:val="18"/>
+        </w:rPr>
+        <w:t>internal label: S14</w:t>
       </w:r>
     </w:p>
     <w:p>
@@ -19050,7 +19517,7 @@
           <w:color w:val="6B7263"/>
           <w:sz w:val="18"/>
         </w:rPr>
-        <w:t>Confused with: S08.a.l (2); M01 (1)</w:t>
+        <w:t>Confused with: MD17 (1); MD18 (1)</w:t>
       </w:r>
     </w:p>
     <w:tbl>
@@ -19319,7 +19786,18 @@
         <w:pStyle w:val="Heading3"/>
       </w:pPr>
       <w:r>
-        <w:t>S07 — Alpine snowbed forb turf</w:t>
+        <w:t>AW44 — Alpine snowbed forb turf</w:t>
+      </w:r>
+    </w:p>
+    <w:p>
+      <w:r>
+        <w:rPr>
+          <w:b w:val="0"/>
+          <w:i w:val="0"/>
+          <w:color w:val="6B7263"/>
+          <w:sz w:val="18"/>
+        </w:rPr>
+        <w:t>internal label: S07</w:t>
       </w:r>
     </w:p>
     <w:p>
@@ -19341,7 +19819,7 @@
           <w:color w:val="6B7263"/>
           <w:sz w:val="18"/>
         </w:rPr>
-        <w:t>n = 26  (’18/’23/’25/’26: 20/5/1/0)   snow-free DOY 170   joint recall 0.69   bare NA%   NPV 2.9%</w:t>
+        <w:t>n = 26  (’18/’23/’25/’26: 20/5/1/0)   snow-free DOY 170   joint recall 0.65   bare NA%   NPV 2.9%</w:t>
       </w:r>
     </w:p>
     <w:p>
@@ -19368,7 +19846,7 @@
           <w:color w:val="6B7263"/>
           <w:sz w:val="18"/>
         </w:rPr>
-        <w:t>Confused with: M02 (3); Veratrum tenuipetalum (2)</w:t>
+        <w:t>Confused with: SW29 (3); SM40 (2)</w:t>
       </w:r>
     </w:p>
     <w:tbl>
@@ -19874,7 +20352,7 @@
               <w:rPr>
                 <w:sz w:val="17"/>
               </w:rPr>
-              <w:t>0.72</w:t>
+              <w:t>0.74</w:t>
             </w:r>
           </w:p>
         </w:tc>
@@ -19887,7 +20365,7 @@
               <w:rPr>
                 <w:sz w:val="17"/>
               </w:rPr>
-              <w:t>Salix wolfii (8); Salix boothii (4)</w:t>
+              <w:t>Salix wolfii (9); Salix boothii (4)</w:t>
             </w:r>
           </w:p>
         </w:tc>
@@ -19954,7 +20432,7 @@
               <w:rPr>
                 <w:sz w:val="17"/>
               </w:rPr>
-              <w:t>0.70</w:t>
+              <w:t>0.67</w:t>
             </w:r>
           </w:p>
         </w:tc>
@@ -19967,7 +20445,7 @@
               <w:rPr>
                 <w:sz w:val="17"/>
               </w:rPr>
-              <w:t>Salix other (7); Dasiphora fruticosa (3)</w:t>
+              <w:t>Salix other (5); Dasiphora fruticosa (3)</w:t>
             </w:r>
           </w:p>
         </w:tc>
@@ -20047,7 +20525,7 @@
               <w:rPr>
                 <w:sz w:val="17"/>
               </w:rPr>
-              <w:t>Artemisia tridentata (2); Salix wolfii (2)</w:t>
+              <w:t>Artemisia tridentata (3); Salix other (2)</w:t>
             </w:r>
           </w:p>
         </w:tc>
@@ -20114,7 +20592,7 @@
               <w:rPr>
                 <w:sz w:val="17"/>
               </w:rPr>
-              <w:t>0.43</w:t>
+              <w:t>0.40</w:t>
             </w:r>
           </w:p>
         </w:tc>
@@ -20127,7 +20605,7 @@
               <w:rPr>
                 <w:sz w:val="17"/>
               </w:rPr>
-              <w:t>Salix other (12); Salix wolfii (2)</w:t>
+              <w:t>Salix other (12); Juniperus sp. (2)</w:t>
             </w:r>
           </w:p>
         </w:tc>
@@ -20194,7 +20672,7 @@
               <w:rPr>
                 <w:sz w:val="17"/>
               </w:rPr>
-              <w:t>0.46</w:t>
+              <w:t>0.43</w:t>
             </w:r>
           </w:p>
         </w:tc>
@@ -20207,7 +20685,7 @@
               <w:rPr>
                 <w:sz w:val="17"/>
               </w:rPr>
-              <w:t>Salix other (7); Salix boothii (3)</w:t>
+              <w:t>Salix other (7); Salix boothii (4)</w:t>
             </w:r>
           </w:p>
         </w:tc>
@@ -20367,7 +20845,7 @@
               <w:rPr>
                 <w:sz w:val="17"/>
               </w:rPr>
-              <w:t>Ribes sp. (4); Dasiphora fruticosa (3)</w:t>
+              <w:t>Ribes sp. (3); Dasiphora fruticosa (2)</w:t>
             </w:r>
           </w:p>
         </w:tc>
@@ -20434,7 +20912,7 @@
               <w:rPr>
                 <w:sz w:val="17"/>
               </w:rPr>
-              <w:t>0.50</w:t>
+              <w:t>0.56</w:t>
             </w:r>
           </w:p>
         </w:tc>
@@ -20447,7 +20925,7 @@
               <w:rPr>
                 <w:sz w:val="17"/>
               </w:rPr>
-              <w:t>Sambucus racemosa (3); Amelanchier alnifolia (2)</w:t>
+              <w:t>Salix other (3); Amelanchier alnifolia (2)</w:t>
             </w:r>
           </w:p>
         </w:tc>
@@ -20527,7 +21005,7 @@
               <w:rPr>
                 <w:sz w:val="17"/>
               </w:rPr>
-              <w:t>Dasiphora fruticosa (3); S05.a (1)</w:t>
+              <w:t>Dasiphora fruticosa (3)</w:t>
             </w:r>
           </w:p>
         </w:tc>
@@ -20594,7 +21072,7 @@
               <w:rPr>
                 <w:sz w:val="17"/>
               </w:rPr>
-              <w:t>0.75</w:t>
+              <w:t>0.67</w:t>
             </w:r>
           </w:p>
         </w:tc>
@@ -20674,7 +21152,7 @@
               <w:rPr>
                 <w:sz w:val="17"/>
               </w:rPr>
-              <w:t>0.18</w:t>
+              <w:t>0.09</w:t>
             </w:r>
           </w:p>
         </w:tc>
@@ -20687,7 +21165,7 @@
               <w:rPr>
                 <w:sz w:val="17"/>
               </w:rPr>
-              <w:t>Salix other (4); Dasiphora fruticosa (3)</w:t>
+              <w:t>Dasiphora fruticosa (5); Salix other (3)</w:t>
             </w:r>
           </w:p>
         </w:tc>
@@ -20767,7 +21245,7 @@
               <w:rPr>
                 <w:sz w:val="17"/>
               </w:rPr>
-              <w:t>Cornus sericea (1); Lonicera involucrata (1)</w:t>
+              <w:t>Cornus sericea (2); Lonicera involucrata (1)</w:t>
             </w:r>
           </w:p>
         </w:tc>
@@ -20847,7 +21325,7 @@
               <w:rPr>
                 <w:sz w:val="17"/>
               </w:rPr>
-              <w:t>Salix other (2); Salix wolfii (2)</w:t>
+              <w:t>Salix other (3); Alnus incana (1)</w:t>
             </w:r>
           </w:p>
         </w:tc>
@@ -20994,7 +21472,7 @@
               <w:rPr>
                 <w:sz w:val="17"/>
               </w:rPr>
-              <w:t>0.67</w:t>
+              <w:t>0.50</w:t>
             </w:r>
           </w:p>
         </w:tc>
@@ -21087,7 +21565,7 @@
               <w:rPr>
                 <w:sz w:val="17"/>
               </w:rPr>
-              <w:t>Artemisia tridentata (1)</w:t>
+              <w:t>Artemisia tridentata (2); Amelanchier alnifolia (1)</w:t>
             </w:r>
           </w:p>
         </w:tc>

</xml_diff>